<commit_message>
Remove inline figures/tables from manuscripts; add separate table files
EJP requires figures and tables as separate upload files, not embedded
in the main manuscript text.

Changes:
- EN/JA manuscripts: removed all inline add_figure() and add_table()
  calls; text references (Fig. 1, Table 2, etc.) preserved
- EN/JA manuscripts: added Table legends and Figure legends sections
  at end of manuscript (after References)
- New: EJP_tables_EN.docx / EJP_tables_JA.docx (editable tables)
- Updated title to match user's revision
- Updated Significance statement (68 words, non-redundant with
  conclusions)
- Updated cover letter title

Co-Authored-By: Tatsuki Onishi <bougtoir@gmail.com>
</commit_message>
<xml_diff>
--- a/ndb-pain-regional-variation-japan/output/ejp/EJP_cover_letter.docx
+++ b/ndb-pain-regional-variation-japan/output/ejp/EJP_cover_letter.docx
@@ -4,7 +4,7 @@
   <w:body>
     <w:p>
       <w:r>
-        <w:t>May 08, 2026</w:t>
+        <w:t>May 09, 2026</w:t>
       </w:r>
     </w:p>
     <w:p/>
@@ -32,7 +32,7 @@
     <w:p/>
     <w:p>
       <w:r>
-        <w:t>We respectfully submit the enclosed manuscript entitled “‘Japanese Patient’? — A Patient. Regional Heterogeneity in Pain-Related Prescribing Across Japan’s 47 Prefectures Challenges the Stereotype of a Stoic Monolith” for consideration as an Original Article in the European Journal of Pain.</w:t>
+        <w:t>We respectfully submit the enclosed manuscript entitled “Regional Heterogeneity in Pain-Related Prescribing Across Japan’s 47 Prefectures Challenges a Stoic Monolithic Patient Stereotype: an ecological study” for consideration as an Original Article in the European Journal of Pain.</w:t>
       </w:r>
     </w:p>
     <w:p>

</xml_diff>